<commit_message>
added the images missing
</commit_message>
<xml_diff>
--- a/lab1/General_Report_OS_Labs_1-2.docx
+++ b/lab1/General_Report_OS_Labs_1-2.docx
@@ -328,7 +328,7 @@
         <w:t>init(Ubuntu)</w:t>
       </w:r>
       <w:r>
-        <w:t xml:space="preserve">, inițializatorul WSL; rulează doar 10 procese. Procesul </w:t>
+        <w:t xml:space="preserve">, inițializatorul WSL; rulează doar 9 procese. Procesul </w:t>
       </w:r>
       <w:r>
         <w:rPr>
@@ -373,7 +373,7 @@
         <w:t>sleep</w:t>
       </w:r>
       <w:r>
-        <w:t xml:space="preserve"> ocupă 7892 kB în RAM.</w:t>
+        <w:t xml:space="preserve"> ocupă 7916 kB în RAM.</w:t>
       </w:r>
     </w:p>
     <w:p>

</xml_diff>